<commit_message>
Built site for serodynamics@0.0.0.9055: 882bd84
</commit_message>
<xml_diff>
--- a/preview/pr221/articles/manuscript.docx
+++ b/preview/pr221/articles/manuscript.docx
@@ -709,7 +709,7 @@
         <w:t xml:space="preserve"> </w:t>
       </w:r>
       <w:r>
-        <w:t xml:space="preserve">package manager. The package requires JAGS (Just Another Gibbs Sampler) to be installed on the user’s system for Bayesian MCMC computation. Nineteen exported functions guide users from data import and simulation to model fitting, diagnostics, and visualization. All functions in the current version of</w:t>
+        <w:t xml:space="preserve">package manager. The package requires JAGS (Just Another Gibbs Sampler) to be installed on the user’s system for Bayesian MCMC computation. Exported functions guide users from data import and simulation to model fitting, diagnostics, and visualization. All functions in the current version of</w:t>
       </w:r>
       <w:r>
         <w:t xml:space="preserve"> </w:t>
@@ -2417,7 +2417,22 @@
         <w:t xml:space="preserve"> </w:t>
       </w:r>
       <w:r>
-        <w:t xml:space="preserve">containing MCMC samples from the joint posterior distribution, with columns for iteration, chain, parameter, antigen–isotype, stratification level, subject identifier, and parameter value. Fitted values and residuals are computed automatically using</w:t>
+        <w:t xml:space="preserve">containing MCMC samples from the joint posterior distribution, with columns for iteration, chain, parameter, antigen–isotype, stratification level, subject identifier, and parameter value. Fitted values and residuals are computed automatically when</w:t>
+      </w:r>
+      <w:r>
+        <w:t xml:space="preserve"> </w:t>
+      </w:r>
+      <w:r>
+        <w:rPr>
+          <w:rStyle w:val="VerbatimChar"/>
+        </w:rPr>
+        <w:t xml:space="preserve">run_mod()</w:t>
+      </w:r>
+      <w:r>
+        <w:t xml:space="preserve"> </w:t>
+      </w:r>
+      <w:r>
+        <w:t xml:space="preserve">completes, via</w:t>
       </w:r>
       <w:r>
         <w:t xml:space="preserve"> </w:t>
@@ -2429,10 +2444,7 @@
         <w:t xml:space="preserve">calc_fit_mod()</w:t>
       </w:r>
       <w:r>
-        <w:t xml:space="preserve"> </w:t>
-      </w:r>
-      <w:r>
-        <w:t xml:space="preserve">and stored as attributes of the output object, alongside the prior specification used in model fitting.</w:t>
+        <w:t xml:space="preserve">, and stored as attributes of the output object alongside the prior specification used in model fitting.</w:t>
       </w:r>
     </w:p>
     <w:p>
@@ -3668,7 +3680,7 @@
         <w:t xml:space="preserve">2025)</w:t>
       </w:r>
       <w:r>
-        <w:t xml:space="preserve">. Collectively, these packages expand access to seroepidemiologic tools. Notably,</w:t>
+        <w:t xml:space="preserve">. Collectively, these packages expand access to seroepidemiologic tools. Among these tools,</w:t>
       </w:r>
       <w:r>
         <w:t xml:space="preserve"> </w:t>
@@ -3683,7 +3695,7 @@
         <w:t xml:space="preserve"> </w:t>
       </w:r>
       <w:r>
-        <w:t xml:space="preserve">is the only package to implement the mechanistic two-phase within-host model using a hierarchical population structure that produces output directly compatible with downstream seroincidence estimation tools.</w:t>
+        <w:t xml:space="preserve">is distinctive in implementing the mechanistic two-phase within-host model using a hierarchical population structure, with output directly compatible with downstream seroincidence estimation tools.</w:t>
       </w:r>
     </w:p>
     <w:p>

</xml_diff>

<commit_message>
Built site for serodynamics@0.0.0.9055: 5217c84
</commit_message>
<xml_diff>
--- a/preview/pr221/articles/manuscript.docx
+++ b/preview/pr221/articles/manuscript.docx
@@ -55,7 +55,7 @@
         <w:pStyle w:val="Date"/>
       </w:pPr>
       <w:r>
-        <w:t xml:space="preserve">2026-05-20</w:t>
+        <w:t xml:space="preserve">2026-05-21</w:t>
       </w:r>
     </w:p>
     <w:sdt>
@@ -3936,7 +3936,7 @@
       </w:r>
     </w:p>
     <w:bookmarkEnd w:id="28"/>
-    <w:bookmarkStart w:id="62" w:name="figure-captions"/>
+    <w:bookmarkStart w:id="29" w:name="figure-captions"/>
     <w:p>
       <w:pPr>
         <w:pStyle w:val="Heading1"/>
@@ -4078,8 +4078,18 @@
         <w:t xml:space="preserve">for downstream seroincidence estimation. To be added once the end-to-end workflow code is finalised.]</w:t>
       </w:r>
     </w:p>
-    <w:bookmarkStart w:id="61" w:name="refs"/>
-    <w:bookmarkStart w:id="30" w:name="ref-aiemjoy2024"/>
+    <w:bookmarkEnd w:id="29"/>
+    <w:bookmarkStart w:id="63" w:name="references"/>
+    <w:p>
+      <w:pPr>
+        <w:pStyle w:val="Heading1"/>
+      </w:pPr>
+      <w:r>
+        <w:t xml:space="preserve">References</w:t>
+      </w:r>
+    </w:p>
+    <w:bookmarkStart w:id="62" w:name="refs"/>
+    <w:bookmarkStart w:id="31" w:name="ref-aiemjoy2024"/>
     <w:p>
       <w:pPr>
         <w:pStyle w:val="Bibliography"/>
@@ -4115,7 +4125,7 @@
       <w:r>
         <w:t xml:space="preserve"> </w:t>
       </w:r>
-      <w:hyperlink r:id="rId29">
+      <w:hyperlink r:id="rId30">
         <w:r>
           <w:rPr>
             <w:rStyle w:val="Hyperlink"/>
@@ -4127,8 +4137,8 @@
         <w:t xml:space="preserve">.</w:t>
       </w:r>
     </w:p>
-    <w:bookmarkEnd w:id="30"/>
-    <w:bookmarkStart w:id="32" w:name="ref-aiemjoy2022"/>
+    <w:bookmarkEnd w:id="31"/>
+    <w:bookmarkStart w:id="33" w:name="ref-aiemjoy2022"/>
     <w:p>
       <w:pPr>
         <w:pStyle w:val="Bibliography"/>
@@ -4176,7 +4186,7 @@
       <w:r>
         <w:t xml:space="preserve"> </w:t>
       </w:r>
-      <w:hyperlink r:id="rId31">
+      <w:hyperlink r:id="rId32">
         <w:r>
           <w:rPr>
             <w:rStyle w:val="Hyperlink"/>
@@ -4188,8 +4198,8 @@
         <w:t xml:space="preserve">.</w:t>
       </w:r>
     </w:p>
-    <w:bookmarkEnd w:id="32"/>
-    <w:bookmarkStart w:id="34" w:name="ref-graaf2014"/>
+    <w:bookmarkEnd w:id="33"/>
+    <w:bookmarkStart w:id="35" w:name="ref-graaf2014"/>
     <w:p>
       <w:pPr>
         <w:pStyle w:val="Bibliography"/>
@@ -4225,7 +4235,7 @@
       <w:r>
         <w:t xml:space="preserve"> </w:t>
       </w:r>
-      <w:hyperlink r:id="rId33">
+      <w:hyperlink r:id="rId34">
         <w:r>
           <w:rPr>
             <w:rStyle w:val="Hyperlink"/>
@@ -4237,8 +4247,8 @@
         <w:t xml:space="preserve">.</w:t>
       </w:r>
     </w:p>
-    <w:bookmarkEnd w:id="34"/>
-    <w:bookmarkStart w:id="36" w:name="ref-garrett2022"/>
+    <w:bookmarkEnd w:id="35"/>
+    <w:bookmarkStart w:id="37" w:name="ref-garrett2022"/>
     <w:p>
       <w:pPr>
         <w:pStyle w:val="Bibliography"/>
@@ -4358,7 +4368,7 @@
       <w:r>
         <w:t xml:space="preserve"> </w:t>
       </w:r>
-      <w:hyperlink r:id="rId35">
+      <w:hyperlink r:id="rId36">
         <w:r>
           <w:rPr>
             <w:rStyle w:val="Hyperlink"/>
@@ -4370,8 +4380,8 @@
         <w:t xml:space="preserve">.</w:t>
       </w:r>
     </w:p>
-    <w:bookmarkEnd w:id="36"/>
-    <w:bookmarkStart w:id="38" w:name="ref-hay2020"/>
+    <w:bookmarkEnd w:id="37"/>
+    <w:bookmarkStart w:id="39" w:name="ref-hay2020"/>
     <w:p>
       <w:pPr>
         <w:pStyle w:val="Bibliography"/>
@@ -4407,7 +4417,7 @@
       <w:r>
         <w:t xml:space="preserve"> </w:t>
       </w:r>
-      <w:hyperlink r:id="rId37">
+      <w:hyperlink r:id="rId38">
         <w:r>
           <w:rPr>
             <w:rStyle w:val="Hyperlink"/>
@@ -4419,8 +4429,8 @@
         <w:t xml:space="preserve">.</w:t>
       </w:r>
     </w:p>
-    <w:bookmarkEnd w:id="38"/>
-    <w:bookmarkStart w:id="40" w:name="ref-hay2024"/>
+    <w:bookmarkEnd w:id="39"/>
+    <w:bookmarkStart w:id="41" w:name="ref-hay2024"/>
     <w:p>
       <w:pPr>
         <w:pStyle w:val="Bibliography"/>
@@ -4465,7 +4475,7 @@
       <w:r>
         <w:t xml:space="preserve"> </w:t>
       </w:r>
-      <w:hyperlink r:id="rId39">
+      <w:hyperlink r:id="rId40">
         <w:r>
           <w:rPr>
             <w:rStyle w:val="Hyperlink"/>
@@ -4477,8 +4487,8 @@
         <w:t xml:space="preserve">.</w:t>
       </w:r>
     </w:p>
-    <w:bookmarkEnd w:id="40"/>
-    <w:bookmarkStart w:id="41" w:name="ref-hodgson2025"/>
+    <w:bookmarkEnd w:id="41"/>
+    <w:bookmarkStart w:id="42" w:name="ref-hodgson2025"/>
     <w:p>
       <w:pPr>
         <w:pStyle w:val="Bibliography"/>
@@ -4545,8 +4555,8 @@
         <w:t xml:space="preserve">.</w:t>
       </w:r>
     </w:p>
-    <w:bookmarkEnd w:id="41"/>
-    <w:bookmarkStart w:id="43" w:name="ref-hoze2025"/>
+    <w:bookmarkEnd w:id="42"/>
+    <w:bookmarkStart w:id="44" w:name="ref-hoze2025"/>
     <w:p>
       <w:pPr>
         <w:pStyle w:val="Bibliography"/>
@@ -4609,7 +4619,7 @@
       <w:r>
         <w:t xml:space="preserve"> </w:t>
       </w:r>
-      <w:hyperlink r:id="rId42">
+      <w:hyperlink r:id="rId43">
         <w:r>
           <w:rPr>
             <w:rStyle w:val="Hyperlink"/>
@@ -4621,8 +4631,8 @@
         <w:t xml:space="preserve">.</w:t>
       </w:r>
     </w:p>
-    <w:bookmarkEnd w:id="43"/>
-    <w:bookmarkStart w:id="45" w:name="ref-lai2025"/>
+    <w:bookmarkEnd w:id="44"/>
+    <w:bookmarkStart w:id="46" w:name="ref-lai2025"/>
     <w:p>
       <w:pPr>
         <w:pStyle w:val="Bibliography"/>
@@ -4664,7 +4674,7 @@
       <w:r>
         <w:t xml:space="preserve"> </w:t>
       </w:r>
-      <w:hyperlink r:id="rId44">
+      <w:hyperlink r:id="rId45">
         <w:r>
           <w:rPr>
             <w:rStyle w:val="Hyperlink"/>
@@ -4676,8 +4686,8 @@
         <w:t xml:space="preserve">.</w:t>
       </w:r>
     </w:p>
-    <w:bookmarkEnd w:id="45"/>
-    <w:bookmarkStart w:id="46" w:name="ref-lee_inprep"/>
+    <w:bookmarkEnd w:id="46"/>
+    <w:bookmarkStart w:id="47" w:name="ref-lee_inprep"/>
     <w:p>
       <w:pPr>
         <w:pStyle w:val="Bibliography"/>
@@ -4701,8 +4711,8 @@
         <w:t xml:space="preserve">Unpublished manuscript.</w:t>
       </w:r>
     </w:p>
-    <w:bookmarkEnd w:id="46"/>
-    <w:bookmarkStart w:id="48" w:name="ref-menezes2023"/>
+    <w:bookmarkEnd w:id="47"/>
+    <w:bookmarkStart w:id="49" w:name="ref-menezes2023"/>
     <w:p>
       <w:pPr>
         <w:pStyle w:val="Bibliography"/>
@@ -4753,7 +4763,7 @@
       <w:r>
         <w:t xml:space="preserve"> </w:t>
       </w:r>
-      <w:hyperlink r:id="rId47">
+      <w:hyperlink r:id="rId48">
         <w:r>
           <w:rPr>
             <w:rStyle w:val="Hyperlink"/>
@@ -4765,8 +4775,8 @@
         <w:t xml:space="preserve">.</w:t>
       </w:r>
     </w:p>
-    <w:bookmarkEnd w:id="48"/>
-    <w:bookmarkStart w:id="50" w:name="ref-simonsen2009"/>
+    <w:bookmarkEnd w:id="49"/>
+    <w:bookmarkStart w:id="51" w:name="ref-simonsen2009"/>
     <w:p>
       <w:pPr>
         <w:pStyle w:val="Bibliography"/>
@@ -4799,7 +4809,7 @@
       <w:r>
         <w:t xml:space="preserve"> </w:t>
       </w:r>
-      <w:hyperlink r:id="rId49">
+      <w:hyperlink r:id="rId50">
         <w:r>
           <w:rPr>
             <w:rStyle w:val="Hyperlink"/>
@@ -4811,8 +4821,8 @@
         <w:t xml:space="preserve">.</w:t>
       </w:r>
     </w:p>
-    <w:bookmarkEnd w:id="50"/>
-    <w:bookmarkStart w:id="52" w:name="ref-teunis2020"/>
+    <w:bookmarkEnd w:id="51"/>
+    <w:bookmarkStart w:id="53" w:name="ref-teunis2020"/>
     <w:p>
       <w:pPr>
         <w:pStyle w:val="Bibliography"/>
@@ -4860,7 +4870,7 @@
       <w:r>
         <w:t xml:space="preserve"> </w:t>
       </w:r>
-      <w:hyperlink r:id="rId51">
+      <w:hyperlink r:id="rId52">
         <w:r>
           <w:rPr>
             <w:rStyle w:val="Hyperlink"/>
@@ -4872,8 +4882,8 @@
         <w:t xml:space="preserve">.</w:t>
       </w:r>
     </w:p>
-    <w:bookmarkEnd w:id="52"/>
-    <w:bookmarkStart w:id="54" w:name="ref-teunis2012"/>
+    <w:bookmarkEnd w:id="53"/>
+    <w:bookmarkStart w:id="55" w:name="ref-teunis2012"/>
     <w:p>
       <w:pPr>
         <w:pStyle w:val="Bibliography"/>
@@ -4921,7 +4931,7 @@
       <w:r>
         <w:t xml:space="preserve"> </w:t>
       </w:r>
-      <w:hyperlink r:id="rId53">
+      <w:hyperlink r:id="rId54">
         <w:r>
           <w:rPr>
             <w:rStyle w:val="Hyperlink"/>
@@ -4933,8 +4943,8 @@
         <w:t xml:space="preserve">.</w:t>
       </w:r>
     </w:p>
-    <w:bookmarkEnd w:id="54"/>
-    <w:bookmarkStart w:id="56" w:name="ref-teunis2016"/>
+    <w:bookmarkEnd w:id="55"/>
+    <w:bookmarkStart w:id="57" w:name="ref-teunis2016"/>
     <w:p>
       <w:pPr>
         <w:pStyle w:val="Bibliography"/>
@@ -4970,7 +4980,7 @@
       <w:r>
         <w:t xml:space="preserve"> </w:t>
       </w:r>
-      <w:hyperlink r:id="rId55">
+      <w:hyperlink r:id="rId56">
         <w:r>
           <w:rPr>
             <w:rStyle w:val="Hyperlink"/>
@@ -4982,8 +4992,8 @@
         <w:t xml:space="preserve">.</w:t>
       </w:r>
     </w:p>
-    <w:bookmarkEnd w:id="56"/>
-    <w:bookmarkStart w:id="58" w:name="ref-teunis2023"/>
+    <w:bookmarkEnd w:id="57"/>
+    <w:bookmarkStart w:id="59" w:name="ref-teunis2023"/>
     <w:p>
       <w:pPr>
         <w:pStyle w:val="Bibliography"/>
@@ -5028,7 +5038,7 @@
       <w:r>
         <w:t xml:space="preserve"> </w:t>
       </w:r>
-      <w:hyperlink r:id="rId57">
+      <w:hyperlink r:id="rId58">
         <w:r>
           <w:rPr>
             <w:rStyle w:val="Hyperlink"/>
@@ -5040,8 +5050,8 @@
         <w:t xml:space="preserve">.</w:t>
       </w:r>
     </w:p>
-    <w:bookmarkEnd w:id="58"/>
-    <w:bookmarkStart w:id="60" w:name="ref-vehtari2021"/>
+    <w:bookmarkEnd w:id="59"/>
+    <w:bookmarkStart w:id="61" w:name="ref-vehtari2021"/>
     <w:p>
       <w:pPr>
         <w:pStyle w:val="Bibliography"/>
@@ -5110,7 +5120,7 @@
       <w:r>
         <w:t xml:space="preserve"> </w:t>
       </w:r>
-      <w:hyperlink r:id="rId59">
+      <w:hyperlink r:id="rId60">
         <w:r>
           <w:rPr>
             <w:rStyle w:val="Hyperlink"/>
@@ -5122,9 +5132,9 @@
         <w:t xml:space="preserve">.</w:t>
       </w:r>
     </w:p>
-    <w:bookmarkEnd w:id="60"/>
     <w:bookmarkEnd w:id="61"/>
     <w:bookmarkEnd w:id="62"/>
+    <w:bookmarkEnd w:id="63"/>
     <w:sectPr>
       <w:footnotePr>
         <w:numRestart w:val="eachSect"/>

</xml_diff>